<commit_message>
Commiting tools and RAG code
</commit_message>
<xml_diff>
--- a/Documents/AgenticAI.docx
+++ b/Documents/AgenticAI.docx
@@ -189,14 +189,7 @@
           <w:b/>
           <w:bCs/>
         </w:rPr>
-        <w:t>The crisp definition for agent</w:t>
-      </w:r>
-      <w:r>
-        <w:rPr>
-          <w:b/>
-          <w:bCs/>
-        </w:rPr>
-        <w:t>ic AI:</w:t>
+        <w:t>The crisp definition for agentic AI:</w:t>
       </w:r>
       <w:r>
         <w:rPr>
@@ -1810,7 +1803,7 @@
     <w:p>
       <w:pPr>
         <w:numPr>
-          <w:ilvl w:val="0"/>
+          <w:ilvl w:val="1"/>
           <w:numId w:val="5"/>
         </w:numPr>
       </w:pPr>
@@ -1819,10 +1812,127 @@
           <w:b/>
           <w:bCs/>
         </w:rPr>
-        <w:t>Reranking</w:t>
-      </w:r>
-      <w:r>
-        <w:t xml:space="preserve"> — a second-stage model (often a cross-encoder) re-orders retrieved chunks for relevance.</w:t>
+        <w:t>Fixed-Size Chunking:</w:t>
+      </w:r>
+      <w:r>
+        <w:t xml:space="preserve"> Splits text into equal-sized segments based on characters or tokens, often with an overlap to maintain context. It is fast and simple but can break sentences.</w:t>
+      </w:r>
+    </w:p>
+    <w:p>
+      <w:pPr>
+        <w:numPr>
+          <w:ilvl w:val="1"/>
+          <w:numId w:val="5"/>
+        </w:numPr>
+      </w:pPr>
+      <w:r>
+        <w:rPr>
+          <w:b/>
+          <w:bCs/>
+        </w:rPr>
+        <w:t>Recursive Character Splitter:</w:t>
+      </w:r>
+      <w:r>
+        <w:t xml:space="preserve"> Splits text using hierarchical separators (e.g., paragraphs, then sentences) until the desired chunk size is reached, preserving context better than </w:t>
+      </w:r>
+      <w:proofErr w:type="gramStart"/>
+      <w:r>
+        <w:t>fixed-size</w:t>
+      </w:r>
+      <w:proofErr w:type="gramEnd"/>
+      <w:r>
+        <w:t>.</w:t>
+      </w:r>
+    </w:p>
+    <w:p>
+      <w:pPr>
+        <w:numPr>
+          <w:ilvl w:val="1"/>
+          <w:numId w:val="5"/>
+        </w:numPr>
+      </w:pPr>
+      <w:r>
+        <w:rPr>
+          <w:b/>
+          <w:bCs/>
+        </w:rPr>
+        <w:lastRenderedPageBreak/>
+        <w:t>Semantic Chunking:</w:t>
+      </w:r>
+      <w:r>
+        <w:t xml:space="preserve"> Analyzes sentence embeddings to split text at points of low similarity, ensuring each chunk contains closely related information.</w:t>
+      </w:r>
+    </w:p>
+    <w:p>
+      <w:pPr>
+        <w:numPr>
+          <w:ilvl w:val="1"/>
+          <w:numId w:val="5"/>
+        </w:numPr>
+      </w:pPr>
+      <w:r>
+        <w:rPr>
+          <w:b/>
+          <w:bCs/>
+        </w:rPr>
+        <w:t>Document-Structure-Aware Chunking:</w:t>
+      </w:r>
+      <w:r>
+        <w:t xml:space="preserve"> Uses document structure like Markdown headings, HTML tags, or paragraph breaks to create meaningful chunks.</w:t>
+      </w:r>
+    </w:p>
+    <w:p>
+      <w:pPr>
+        <w:numPr>
+          <w:ilvl w:val="1"/>
+          <w:numId w:val="5"/>
+        </w:numPr>
+      </w:pPr>
+      <w:r>
+        <w:rPr>
+          <w:b/>
+          <w:bCs/>
+        </w:rPr>
+        <w:t>Page-Level Chunking:</w:t>
+      </w:r>
+      <w:r>
+        <w:t xml:space="preserve"> Splits documents based on actual page numbers (e.g., in PDF reports), which can offer high retrieval consistency.</w:t>
+      </w:r>
+    </w:p>
+    <w:p>
+      <w:pPr>
+        <w:numPr>
+          <w:ilvl w:val="1"/>
+          <w:numId w:val="5"/>
+        </w:numPr>
+      </w:pPr>
+      <w:r>
+        <w:rPr>
+          <w:b/>
+          <w:bCs/>
+        </w:rPr>
+        <w:t>Agentic Chunking:</w:t>
+      </w:r>
+      <w:r>
+        <w:t xml:space="preserve"> Uses an LLM agent to intelligently determine the best places to split, mimicking human judgment for complex documents.</w:t>
+      </w:r>
+    </w:p>
+    <w:p>
+      <w:pPr>
+        <w:numPr>
+          <w:ilvl w:val="1"/>
+          <w:numId w:val="5"/>
+        </w:numPr>
+      </w:pPr>
+      <w:r>
+        <w:rPr>
+          <w:b/>
+          <w:bCs/>
+        </w:rPr>
+        <w:t>Proposition Chunking:</w:t>
+      </w:r>
+      <w:r>
+        <w:t xml:space="preserve"> Breaks text into atomic, independent propositions (tiny nuggets of information) to maximize precision.</w:t>
       </w:r>
     </w:p>
     <w:p>
@@ -1831,24 +1941,99 @@
           <w:ilvl w:val="0"/>
           <w:numId w:val="5"/>
         </w:numPr>
-      </w:pPr>
-      <w:r>
-        <w:rPr>
-          <w:b/>
-          <w:bCs/>
-        </w:rPr>
-        <w:t>Hallucination</w:t>
-      </w:r>
-      <w:r>
-        <w:t xml:space="preserve"> — confident output </w:t>
+        <w:rPr>
+          <w:b/>
+          <w:bCs/>
+        </w:rPr>
+      </w:pPr>
+      <w:r>
+        <w:rPr>
+          <w:b/>
+          <w:bCs/>
+        </w:rPr>
+        <w:t>Choosing the Best Strategy</w:t>
+      </w:r>
+    </w:p>
+    <w:p>
+      <w:pPr>
+        <w:numPr>
+          <w:ilvl w:val="1"/>
+          <w:numId w:val="5"/>
+        </w:numPr>
+      </w:pPr>
+      <w:r>
+        <w:rPr>
+          <w:b/>
+          <w:bCs/>
+        </w:rPr>
+        <w:t>Small Chunks (e.g., 128-256 tokens):</w:t>
+      </w:r>
+      <w:r>
+        <w:t xml:space="preserve"> Best for exact, granular semantic search and </w:t>
       </w:r>
       <w:proofErr w:type="gramStart"/>
       <w:r>
-        <w:t>not</w:t>
+        <w:t>specific fact</w:t>
       </w:r>
       <w:proofErr w:type="gramEnd"/>
       <w:r>
-        <w:t xml:space="preserve"> grounded in input or reality. Mitigated by RAG, citations, and evaluation.</w:t>
+        <w:t xml:space="preserve"> retrieval.</w:t>
+      </w:r>
+    </w:p>
+    <w:p>
+      <w:pPr>
+        <w:numPr>
+          <w:ilvl w:val="1"/>
+          <w:numId w:val="5"/>
+        </w:numPr>
+      </w:pPr>
+      <w:r>
+        <w:rPr>
+          <w:b/>
+          <w:bCs/>
+        </w:rPr>
+        <w:t>Large Chunks (e.g., 512-1024 tokens):</w:t>
+      </w:r>
+      <w:r>
+        <w:t xml:space="preserve"> Best for retaining broader context and thematic information.</w:t>
+      </w:r>
+    </w:p>
+    <w:p>
+      <w:pPr>
+        <w:numPr>
+          <w:ilvl w:val="1"/>
+          <w:numId w:val="5"/>
+        </w:numPr>
+      </w:pPr>
+      <w:r>
+        <w:rPr>
+          <w:b/>
+          <w:bCs/>
+        </w:rPr>
+        <w:t>Best General Approach:</w:t>
+      </w:r>
+      <w:r>
+        <w:t xml:space="preserve"> 2026 benchmarks suggest that </w:t>
+      </w:r>
+      <w:r>
+        <w:rPr>
+          <w:b/>
+          <w:bCs/>
+        </w:rPr>
+        <w:t>page-level</w:t>
+      </w:r>
+      <w:r>
+        <w:t xml:space="preserve"> or </w:t>
+      </w:r>
+      <w:r>
+        <w:rPr>
+          <w:b/>
+          <w:bCs/>
+        </w:rPr>
+        <w:t>small, structured chunks</w:t>
+      </w:r>
+      <w:r>
+        <w:t xml:space="preserve"> often deliver the highest, most consistent retrieval accuracy. </w:t>
       </w:r>
     </w:p>
     <w:p>
@@ -1857,16 +2042,71 @@
           <w:ilvl w:val="0"/>
           <w:numId w:val="5"/>
         </w:numPr>
-      </w:pPr>
-      <w:r>
-        <w:rPr>
-          <w:b/>
-          <w:bCs/>
-        </w:rPr>
-        <w:t>Guardrail</w:t>
-      </w:r>
-      <w:r>
-        <w:t xml:space="preserve"> — a deterministic check around an LLM call (input or output) to enforce policy.</w:t>
+        <w:rPr>
+          <w:b/>
+          <w:bCs/>
+        </w:rPr>
+      </w:pPr>
+      <w:r>
+        <w:rPr>
+          <w:b/>
+          <w:bCs/>
+        </w:rPr>
+        <w:t>Key Considerations</w:t>
+      </w:r>
+    </w:p>
+    <w:p>
+      <w:pPr>
+        <w:numPr>
+          <w:ilvl w:val="1"/>
+          <w:numId w:val="5"/>
+        </w:numPr>
+      </w:pPr>
+      <w:r>
+        <w:rPr>
+          <w:b/>
+          <w:bCs/>
+        </w:rPr>
+        <w:t>Overlapping Chunks:</w:t>
+      </w:r>
+      <w:r>
+        <w:t xml:space="preserve"> When using fixed-size chunks, add a 50–100 token overlap to prevent loss of information at the boundaries.</w:t>
+      </w:r>
+    </w:p>
+    <w:p>
+      <w:pPr>
+        <w:numPr>
+          <w:ilvl w:val="1"/>
+          <w:numId w:val="5"/>
+        </w:numPr>
+      </w:pPr>
+      <w:r>
+        <w:rPr>
+          <w:b/>
+          <w:bCs/>
+        </w:rPr>
+        <w:t>Model Limitations:</w:t>
+      </w:r>
+      <w:r>
+        <w:t xml:space="preserve"> Choose a strategy based on the context window of your embedding model and the target LLM.</w:t>
+      </w:r>
+    </w:p>
+    <w:p>
+      <w:pPr>
+        <w:numPr>
+          <w:ilvl w:val="1"/>
+          <w:numId w:val="5"/>
+        </w:numPr>
+      </w:pPr>
+      <w:r>
+        <w:rPr>
+          <w:b/>
+          <w:bCs/>
+        </w:rPr>
+        <w:t>Cost:</w:t>
+      </w:r>
+      <w:r>
+        <w:t xml:space="preserve"> Semantic and Agentic chunking require more computational resources than simple character splitting.</w:t>
       </w:r>
     </w:p>
     <w:p>
@@ -1881,7 +2121,69 @@
           <w:b/>
           <w:bCs/>
         </w:rPr>
+        <w:t>Reranking</w:t>
+      </w:r>
+      <w:r>
+        <w:t xml:space="preserve"> — a second-stage model (often a cross-encoder) re-orders retrieved chunks for relevance.</w:t>
+      </w:r>
+    </w:p>
+    <w:p>
+      <w:pPr>
+        <w:numPr>
+          <w:ilvl w:val="0"/>
+          <w:numId w:val="5"/>
+        </w:numPr>
+      </w:pPr>
+      <w:r>
+        <w:rPr>
+          <w:b/>
+          <w:bCs/>
+        </w:rPr>
+        <w:t>Hallucination</w:t>
+      </w:r>
+      <w:r>
+        <w:t xml:space="preserve"> — confident output </w:t>
+      </w:r>
+      <w:proofErr w:type="gramStart"/>
+      <w:r>
+        <w:t>not</w:t>
+      </w:r>
+      <w:proofErr w:type="gramEnd"/>
+      <w:r>
+        <w:t xml:space="preserve"> grounded in input or reality. Mitigated by RAG, citations, and evaluation.</w:t>
+      </w:r>
+    </w:p>
+    <w:p>
+      <w:pPr>
+        <w:numPr>
+          <w:ilvl w:val="0"/>
+          <w:numId w:val="5"/>
+        </w:numPr>
+      </w:pPr>
+      <w:r>
+        <w:rPr>
+          <w:b/>
+          <w:bCs/>
+        </w:rPr>
         <w:lastRenderedPageBreak/>
+        <w:t>Guardrail</w:t>
+      </w:r>
+      <w:r>
+        <w:t xml:space="preserve"> — a deterministic check around an LLM call (input or output) to enforce policy.</w:t>
+      </w:r>
+    </w:p>
+    <w:p>
+      <w:pPr>
+        <w:numPr>
+          <w:ilvl w:val="0"/>
+          <w:numId w:val="5"/>
+        </w:numPr>
+      </w:pPr>
+      <w:r>
+        <w:rPr>
+          <w:b/>
+          <w:bCs/>
+        </w:rPr>
         <w:t>Eval</w:t>
       </w:r>
       <w:r>
@@ -2551,6 +2853,155 @@
     </w:lvl>
   </w:abstractNum>
   <w:abstractNum w:abstractNumId="4" w15:restartNumberingAfterBreak="0">
+    <w:nsid w:val="4A0A34A3"/>
+    <w:multiLevelType w:val="multilevel"/>
+    <w:tmpl w:val="FC98EAB8"/>
+    <w:lvl w:ilvl="0">
+      <w:start w:val="1"/>
+      <w:numFmt w:val="bullet"/>
+      <w:lvlText w:val=""/>
+      <w:lvlJc w:val="left"/>
+      <w:pPr>
+        <w:tabs>
+          <w:tab w:val="num" w:pos="720"/>
+        </w:tabs>
+        <w:ind w:left="720" w:hanging="360"/>
+      </w:pPr>
+      <w:rPr>
+        <w:rFonts w:ascii="Symbol" w:hAnsi="Symbol" w:hint="default"/>
+        <w:sz w:val="20"/>
+      </w:rPr>
+    </w:lvl>
+    <w:lvl w:ilvl="1" w:tentative="1">
+      <w:start w:val="1"/>
+      <w:numFmt w:val="bullet"/>
+      <w:lvlText w:val="o"/>
+      <w:lvlJc w:val="left"/>
+      <w:pPr>
+        <w:tabs>
+          <w:tab w:val="num" w:pos="1440"/>
+        </w:tabs>
+        <w:ind w:left="1440" w:hanging="360"/>
+      </w:pPr>
+      <w:rPr>
+        <w:rFonts w:ascii="Courier New" w:hAnsi="Courier New" w:hint="default"/>
+        <w:sz w:val="20"/>
+      </w:rPr>
+    </w:lvl>
+    <w:lvl w:ilvl="2" w:tentative="1">
+      <w:start w:val="1"/>
+      <w:numFmt w:val="bullet"/>
+      <w:lvlText w:val=""/>
+      <w:lvlJc w:val="left"/>
+      <w:pPr>
+        <w:tabs>
+          <w:tab w:val="num" w:pos="2160"/>
+        </w:tabs>
+        <w:ind w:left="2160" w:hanging="360"/>
+      </w:pPr>
+      <w:rPr>
+        <w:rFonts w:ascii="Wingdings" w:hAnsi="Wingdings" w:hint="default"/>
+        <w:sz w:val="20"/>
+      </w:rPr>
+    </w:lvl>
+    <w:lvl w:ilvl="3" w:tentative="1">
+      <w:start w:val="1"/>
+      <w:numFmt w:val="bullet"/>
+      <w:lvlText w:val=""/>
+      <w:lvlJc w:val="left"/>
+      <w:pPr>
+        <w:tabs>
+          <w:tab w:val="num" w:pos="2880"/>
+        </w:tabs>
+        <w:ind w:left="2880" w:hanging="360"/>
+      </w:pPr>
+      <w:rPr>
+        <w:rFonts w:ascii="Wingdings" w:hAnsi="Wingdings" w:hint="default"/>
+        <w:sz w:val="20"/>
+      </w:rPr>
+    </w:lvl>
+    <w:lvl w:ilvl="4" w:tentative="1">
+      <w:start w:val="1"/>
+      <w:numFmt w:val="bullet"/>
+      <w:lvlText w:val=""/>
+      <w:lvlJc w:val="left"/>
+      <w:pPr>
+        <w:tabs>
+          <w:tab w:val="num" w:pos="3600"/>
+        </w:tabs>
+        <w:ind w:left="3600" w:hanging="360"/>
+      </w:pPr>
+      <w:rPr>
+        <w:rFonts w:ascii="Wingdings" w:hAnsi="Wingdings" w:hint="default"/>
+        <w:sz w:val="20"/>
+      </w:rPr>
+    </w:lvl>
+    <w:lvl w:ilvl="5" w:tentative="1">
+      <w:start w:val="1"/>
+      <w:numFmt w:val="bullet"/>
+      <w:lvlText w:val=""/>
+      <w:lvlJc w:val="left"/>
+      <w:pPr>
+        <w:tabs>
+          <w:tab w:val="num" w:pos="4320"/>
+        </w:tabs>
+        <w:ind w:left="4320" w:hanging="360"/>
+      </w:pPr>
+      <w:rPr>
+        <w:rFonts w:ascii="Wingdings" w:hAnsi="Wingdings" w:hint="default"/>
+        <w:sz w:val="20"/>
+      </w:rPr>
+    </w:lvl>
+    <w:lvl w:ilvl="6" w:tentative="1">
+      <w:start w:val="1"/>
+      <w:numFmt w:val="bullet"/>
+      <w:lvlText w:val=""/>
+      <w:lvlJc w:val="left"/>
+      <w:pPr>
+        <w:tabs>
+          <w:tab w:val="num" w:pos="5040"/>
+        </w:tabs>
+        <w:ind w:left="5040" w:hanging="360"/>
+      </w:pPr>
+      <w:rPr>
+        <w:rFonts w:ascii="Wingdings" w:hAnsi="Wingdings" w:hint="default"/>
+        <w:sz w:val="20"/>
+      </w:rPr>
+    </w:lvl>
+    <w:lvl w:ilvl="7" w:tentative="1">
+      <w:start w:val="1"/>
+      <w:numFmt w:val="bullet"/>
+      <w:lvlText w:val=""/>
+      <w:lvlJc w:val="left"/>
+      <w:pPr>
+        <w:tabs>
+          <w:tab w:val="num" w:pos="5760"/>
+        </w:tabs>
+        <w:ind w:left="5760" w:hanging="360"/>
+      </w:pPr>
+      <w:rPr>
+        <w:rFonts w:ascii="Wingdings" w:hAnsi="Wingdings" w:hint="default"/>
+        <w:sz w:val="20"/>
+      </w:rPr>
+    </w:lvl>
+    <w:lvl w:ilvl="8" w:tentative="1">
+      <w:start w:val="1"/>
+      <w:numFmt w:val="bullet"/>
+      <w:lvlText w:val=""/>
+      <w:lvlJc w:val="left"/>
+      <w:pPr>
+        <w:tabs>
+          <w:tab w:val="num" w:pos="6480"/>
+        </w:tabs>
+        <w:ind w:left="6480" w:hanging="360"/>
+      </w:pPr>
+      <w:rPr>
+        <w:rFonts w:ascii="Wingdings" w:hAnsi="Wingdings" w:hint="default"/>
+        <w:sz w:val="20"/>
+      </w:rPr>
+    </w:lvl>
+  </w:abstractNum>
+  <w:abstractNum w:abstractNumId="5" w15:restartNumberingAfterBreak="0">
     <w:nsid w:val="576F7F44"/>
     <w:multiLevelType w:val="multilevel"/>
     <w:tmpl w:val="4C62D6CC"/>
@@ -2570,7 +3021,7 @@
         <w:sz w:val="20"/>
       </w:rPr>
     </w:lvl>
-    <w:lvl w:ilvl="1" w:tentative="1">
+    <w:lvl w:ilvl="1">
       <w:start w:val="1"/>
       <w:numFmt w:val="bullet"/>
       <w:lvlText w:val="o"/>
@@ -2699,7 +3150,7 @@
       </w:rPr>
     </w:lvl>
   </w:abstractNum>
-  <w:abstractNum w:abstractNumId="5" w15:restartNumberingAfterBreak="0">
+  <w:abstractNum w:abstractNumId="6" w15:restartNumberingAfterBreak="0">
     <w:nsid w:val="5C5208EF"/>
     <w:multiLevelType w:val="multilevel"/>
     <w:tmpl w:val="C2361C18"/>
@@ -2848,7 +3299,7 @@
       </w:rPr>
     </w:lvl>
   </w:abstractNum>
-  <w:abstractNum w:abstractNumId="6" w15:restartNumberingAfterBreak="0">
+  <w:abstractNum w:abstractNumId="7" w15:restartNumberingAfterBreak="0">
     <w:nsid w:val="73D03D01"/>
     <w:multiLevelType w:val="multilevel"/>
     <w:tmpl w:val="2DC8B4C6"/>
@@ -2995,6 +3446,119 @@
         <w:rFonts w:ascii="Wingdings" w:hAnsi="Wingdings" w:hint="default"/>
         <w:sz w:val="20"/>
       </w:rPr>
+    </w:lvl>
+  </w:abstractNum>
+  <w:abstractNum w:abstractNumId="8" w15:restartNumberingAfterBreak="0">
+    <w:nsid w:val="7FC87F1E"/>
+    <w:multiLevelType w:val="multilevel"/>
+    <w:tmpl w:val="E6501952"/>
+    <w:lvl w:ilvl="0">
+      <w:start w:val="1"/>
+      <w:numFmt w:val="decimal"/>
+      <w:lvlText w:val="%1."/>
+      <w:lvlJc w:val="left"/>
+      <w:pPr>
+        <w:tabs>
+          <w:tab w:val="num" w:pos="720"/>
+        </w:tabs>
+        <w:ind w:left="720" w:hanging="360"/>
+      </w:pPr>
+    </w:lvl>
+    <w:lvl w:ilvl="1" w:tentative="1">
+      <w:start w:val="1"/>
+      <w:numFmt w:val="decimal"/>
+      <w:lvlText w:val="%2."/>
+      <w:lvlJc w:val="left"/>
+      <w:pPr>
+        <w:tabs>
+          <w:tab w:val="num" w:pos="1440"/>
+        </w:tabs>
+        <w:ind w:left="1440" w:hanging="360"/>
+      </w:pPr>
+    </w:lvl>
+    <w:lvl w:ilvl="2" w:tentative="1">
+      <w:start w:val="1"/>
+      <w:numFmt w:val="decimal"/>
+      <w:lvlText w:val="%3."/>
+      <w:lvlJc w:val="left"/>
+      <w:pPr>
+        <w:tabs>
+          <w:tab w:val="num" w:pos="2160"/>
+        </w:tabs>
+        <w:ind w:left="2160" w:hanging="360"/>
+      </w:pPr>
+    </w:lvl>
+    <w:lvl w:ilvl="3" w:tentative="1">
+      <w:start w:val="1"/>
+      <w:numFmt w:val="decimal"/>
+      <w:lvlText w:val="%4."/>
+      <w:lvlJc w:val="left"/>
+      <w:pPr>
+        <w:tabs>
+          <w:tab w:val="num" w:pos="2880"/>
+        </w:tabs>
+        <w:ind w:left="2880" w:hanging="360"/>
+      </w:pPr>
+    </w:lvl>
+    <w:lvl w:ilvl="4" w:tentative="1">
+      <w:start w:val="1"/>
+      <w:numFmt w:val="decimal"/>
+      <w:lvlText w:val="%5."/>
+      <w:lvlJc w:val="left"/>
+      <w:pPr>
+        <w:tabs>
+          <w:tab w:val="num" w:pos="3600"/>
+        </w:tabs>
+        <w:ind w:left="3600" w:hanging="360"/>
+      </w:pPr>
+    </w:lvl>
+    <w:lvl w:ilvl="5" w:tentative="1">
+      <w:start w:val="1"/>
+      <w:numFmt w:val="decimal"/>
+      <w:lvlText w:val="%6."/>
+      <w:lvlJc w:val="left"/>
+      <w:pPr>
+        <w:tabs>
+          <w:tab w:val="num" w:pos="4320"/>
+        </w:tabs>
+        <w:ind w:left="4320" w:hanging="360"/>
+      </w:pPr>
+    </w:lvl>
+    <w:lvl w:ilvl="6" w:tentative="1">
+      <w:start w:val="1"/>
+      <w:numFmt w:val="decimal"/>
+      <w:lvlText w:val="%7."/>
+      <w:lvlJc w:val="left"/>
+      <w:pPr>
+        <w:tabs>
+          <w:tab w:val="num" w:pos="5040"/>
+        </w:tabs>
+        <w:ind w:left="5040" w:hanging="360"/>
+      </w:pPr>
+    </w:lvl>
+    <w:lvl w:ilvl="7" w:tentative="1">
+      <w:start w:val="1"/>
+      <w:numFmt w:val="decimal"/>
+      <w:lvlText w:val="%8."/>
+      <w:lvlJc w:val="left"/>
+      <w:pPr>
+        <w:tabs>
+          <w:tab w:val="num" w:pos="5760"/>
+        </w:tabs>
+        <w:ind w:left="5760" w:hanging="360"/>
+      </w:pPr>
+    </w:lvl>
+    <w:lvl w:ilvl="8" w:tentative="1">
+      <w:start w:val="1"/>
+      <w:numFmt w:val="decimal"/>
+      <w:lvlText w:val="%9."/>
+      <w:lvlJc w:val="left"/>
+      <w:pPr>
+        <w:tabs>
+          <w:tab w:val="num" w:pos="6480"/>
+        </w:tabs>
+        <w:ind w:left="6480" w:hanging="360"/>
+      </w:pPr>
     </w:lvl>
   </w:abstractNum>
   <w:num w:numId="1" w16cid:durableId="754017651">
@@ -3010,13 +3574,19 @@
     <w:abstractNumId w:val="0"/>
   </w:num>
   <w:num w:numId="5" w16cid:durableId="1768496317">
+    <w:abstractNumId w:val="5"/>
+  </w:num>
+  <w:num w:numId="6" w16cid:durableId="1660501037">
+    <w:abstractNumId w:val="7"/>
+  </w:num>
+  <w:num w:numId="7" w16cid:durableId="129443497">
+    <w:abstractNumId w:val="6"/>
+  </w:num>
+  <w:num w:numId="8" w16cid:durableId="183979252">
     <w:abstractNumId w:val="4"/>
   </w:num>
-  <w:num w:numId="6" w16cid:durableId="1660501037">
-    <w:abstractNumId w:val="6"/>
-  </w:num>
-  <w:num w:numId="7" w16cid:durableId="129443497">
-    <w:abstractNumId w:val="5"/>
+  <w:num w:numId="9" w16cid:durableId="1405370476">
+    <w:abstractNumId w:val="8"/>
   </w:num>
 </w:numbering>
 </file>
@@ -3624,7 +4194,6 @@
   <w:style w:type="character" w:default="1" w:styleId="DefaultParagraphFont">
     <w:name w:val="Default Paragraph Font"/>
     <w:uiPriority w:val="1"/>
-    <w:semiHidden/>
     <w:unhideWhenUsed/>
   </w:style>
   <w:style w:type="table" w:default="1" w:styleId="TableNormal">
@@ -3938,6 +4507,29 @@
       <w:spacing w:val="5"/>
     </w:rPr>
   </w:style>
+  <w:style w:type="character" w:styleId="Hyperlink">
+    <w:name w:val="Hyperlink"/>
+    <w:basedOn w:val="DefaultParagraphFont"/>
+    <w:uiPriority w:val="99"/>
+    <w:unhideWhenUsed/>
+    <w:rsid w:val="005615FC"/>
+    <w:rPr>
+      <w:color w:val="467886" w:themeColor="hyperlink"/>
+      <w:u w:val="single"/>
+    </w:rPr>
+  </w:style>
+  <w:style w:type="character" w:styleId="UnresolvedMention">
+    <w:name w:val="Unresolved Mention"/>
+    <w:basedOn w:val="DefaultParagraphFont"/>
+    <w:uiPriority w:val="99"/>
+    <w:semiHidden/>
+    <w:unhideWhenUsed/>
+    <w:rsid w:val="005615FC"/>
+    <w:rPr>
+      <w:color w:val="605E5C"/>
+      <w:shd w:val="clear" w:color="auto" w:fill="E1DFDD"/>
+    </w:rPr>
+  </w:style>
 </w:styles>
 </file>
 

</xml_diff>